<commit_message>
removing unnecessary piece that won't go in manuscript
</commit_message>
<xml_diff>
--- a/results/tables/Pst_Fst_table.docx
+++ b/results/tables/Pst_Fst_table.docx
@@ -49,7 +49,7 @@
           <w:sz w:val="24"/>
           <w:color w:val="333333"/>
         </w:rPr>
-        <w:t xml:space="default">Luminance differentiation among sites (Pst) vs genomic Fst</w:t>
+        <w:t xml:space="default">Phenotypic differentiation among sites (PST at c/h² = 1) vs genomic FST</w:t>
       </w:r>
     </w:p>
     <w:tbl xmlns:w="http://schemas.openxmlformats.org/wordprocessingml/2006/main" xmlns:wp="http://schemas.openxmlformats.org/drawingml/2006/wordprocessingDrawing" xmlns:r="http://schemas.openxmlformats.org/officeDocument/2006/relationships" xmlns:w14="http://schemas.microsoft.com/office/word/2010/wordml">
@@ -88,7 +88,7 @@
                 <w:rFonts w:ascii="Calibri" w:hAnsi="Calibri"/>
                 <w:sz w:val="20"/>
               </w:rPr>
-              <w:t xml:space="default">Patch</w:t>
+              <w:t xml:space="default">Trait</w:t>
             </w:r>
           </w:p>
         </w:tc>
@@ -110,7 +110,7 @@
                 <w:rFonts w:ascii="Calibri" w:hAnsi="Calibri"/>
                 <w:sz w:val="20"/>
               </w:rPr>
-              <w:t xml:space="default">n (sites)</w:t>
+              <w:t xml:space="default">PST</w:t>
             </w:r>
           </w:p>
         </w:tc>
@@ -125,14 +125,14 @@
             <w:pPr>
               <w:spacing w:before="0" w:after="60"/>
               <w:keepNext/>
-              <w:jc w:val="start"/>
-            </w:pPr>
-            <w:r>
-              <w:rPr>
-                <w:rFonts w:ascii="Calibri" w:hAnsi="Calibri"/>
-                <w:sz w:val="20"/>
-              </w:rPr>
-              <w:t xml:space="default">Pst at c/h² = 1 (95% CI)</w:t>
+              <w:jc w:val="end"/>
+            </w:pPr>
+            <w:r>
+              <w:rPr>
+                <w:rFonts w:ascii="Calibri" w:hAnsi="Calibri"/>
+                <w:sz w:val="20"/>
+              </w:rPr>
+              <w:t xml:space="default">Lower 95% CI</w:t>
             </w:r>
           </w:p>
         </w:tc>
@@ -141,7 +141,28 @@
             <w:tcBorders>
               <w:top w:val="single" w:sz="16" w:space="0" w:color="D3D3D3"/>
               <w:bottom w:val="single" w:sz="16" w:space="0" w:color="D3D3D3"/>
-              <w:end w:val="single" w:space="0" w:color="D3D3D3"/>
+            </w:tcBorders>
+          </w:tcPr>
+          <w:p>
+            <w:pPr>
+              <w:spacing w:before="0" w:after="60"/>
+              <w:keepNext/>
+              <w:jc w:val="end"/>
+            </w:pPr>
+            <w:r>
+              <w:rPr>
+                <w:rFonts w:ascii="Calibri" w:hAnsi="Calibri"/>
+                <w:sz w:val="20"/>
+              </w:rPr>
+              <w:t xml:space="default">Upper 95% CI</w:t>
+            </w:r>
+          </w:p>
+        </w:tc>
+        <w:tc>
+          <w:tcPr>
+            <w:tcBorders>
+              <w:top w:val="single" w:sz="16" w:space="0" w:color="D3D3D3"/>
+              <w:bottom w:val="single" w:sz="16" w:space="0" w:color="D3D3D3"/>
             </w:tcBorders>
           </w:tcPr>
           <w:p>
@@ -156,6 +177,29 @@
                 <w:sz w:val="20"/>
               </w:rPr>
               <w:t xml:space="default">Critical c/h²</w:t>
+            </w:r>
+          </w:p>
+        </w:tc>
+        <w:tc>
+          <w:tcPr>
+            <w:tcBorders>
+              <w:top w:val="single" w:sz="16" w:space="0" w:color="D3D3D3"/>
+              <w:bottom w:val="single" w:sz="16" w:space="0" w:color="D3D3D3"/>
+              <w:end w:val="single" w:space="0" w:color="D3D3D3"/>
+            </w:tcBorders>
+          </w:tcPr>
+          <w:p>
+            <w:pPr>
+              <w:spacing w:before="0" w:after="60"/>
+              <w:keepNext/>
+              <w:jc w:val="start"/>
+            </w:pPr>
+            <w:r>
+              <w:rPr>
+                <w:rFonts w:ascii="Calibri" w:hAnsi="Calibri"/>
+                <w:sz w:val="20"/>
+              </w:rPr>
+              <w:t xml:space="default">PST–FST</w:t>
             </w:r>
           </w:p>
         </w:tc>
@@ -208,7 +252,55 @@
                 <w:rFonts w:ascii="Calibri" w:hAnsi="Calibri"/>
                 <w:sz w:val="20"/>
               </w:rPr>
-              <w:t xml:space="default">182 (22)</w:t>
+              <w:t xml:space="default">0.341</w:t>
+            </w:r>
+          </w:p>
+        </w:tc>
+        <w:tc>
+          <w:tcPr>
+            <w:tcBorders>
+              <w:top w:val="single" w:space="0" w:color="D3D3D3"/>
+              <w:bottom w:val="single" w:space="0" w:color="D3D3D3"/>
+              <w:start w:val="single" w:space="0" w:color="D3D3D3"/>
+              <w:end w:val="single" w:space="0" w:color="D3D3D3"/>
+            </w:tcBorders>
+          </w:tcPr>
+          <w:p>
+            <w:pPr>
+              <w:spacing w:before="0" w:after="60"/>
+              <w:keepNext/>
+              <w:jc w:val="end"/>
+            </w:pPr>
+            <w:r>
+              <w:rPr>
+                <w:rFonts w:ascii="Calibri" w:hAnsi="Calibri"/>
+                <w:sz w:val="20"/>
+              </w:rPr>
+              <w:t xml:space="default">0.177</w:t>
+            </w:r>
+          </w:p>
+        </w:tc>
+        <w:tc>
+          <w:tcPr>
+            <w:tcBorders>
+              <w:top w:val="single" w:space="0" w:color="D3D3D3"/>
+              <w:bottom w:val="single" w:space="0" w:color="D3D3D3"/>
+              <w:start w:val="single" w:space="0" w:color="D3D3D3"/>
+              <w:end w:val="single" w:space="0" w:color="D3D3D3"/>
+            </w:tcBorders>
+          </w:tcPr>
+          <w:p>
+            <w:pPr>
+              <w:spacing w:before="0" w:after="60"/>
+              <w:keepNext/>
+              <w:jc w:val="end"/>
+            </w:pPr>
+            <w:r>
+              <w:rPr>
+                <w:rFonts w:ascii="Calibri" w:hAnsi="Calibri"/>
+                <w:sz w:val="20"/>
+              </w:rPr>
+              <w:t xml:space="default">0.495</w:t>
             </w:r>
           </w:p>
         </w:tc>
@@ -232,7 +324,7 @@
                 <w:rFonts w:ascii="Calibri" w:hAnsi="Calibri"/>
                 <w:sz w:val="20"/>
               </w:rPr>
-              <w:t xml:space="default">0.34 (0.18–0.49)</w:t>
+              <w:t xml:space="default">0.155</w:t>
             </w:r>
           </w:p>
         </w:tc>
@@ -256,7 +348,7 @@
                 <w:rFonts w:ascii="Calibri" w:hAnsi="Calibri"/>
                 <w:sz w:val="20"/>
               </w:rPr>
-              <w:t xml:space="default">0.16</w:t>
+              <w:t xml:space="default">PST &gt; FST</w:t>
             </w:r>
           </w:p>
         </w:tc>
@@ -309,7 +401,55 @@
                 <w:rFonts w:ascii="Calibri" w:hAnsi="Calibri"/>
                 <w:sz w:val="20"/>
               </w:rPr>
-              <w:t xml:space="default">182 (22)</w:t>
+              <w:t xml:space="default">0.208</w:t>
+            </w:r>
+          </w:p>
+        </w:tc>
+        <w:tc>
+          <w:tcPr>
+            <w:tcBorders>
+              <w:top w:val="single" w:space="0" w:color="D3D3D3"/>
+              <w:bottom w:val="single" w:space="0" w:color="D3D3D3"/>
+              <w:start w:val="single" w:space="0" w:color="D3D3D3"/>
+              <w:end w:val="single" w:space="0" w:color="D3D3D3"/>
+            </w:tcBorders>
+          </w:tcPr>
+          <w:p>
+            <w:pPr>
+              <w:spacing w:before="0" w:after="60"/>
+              <w:keepNext/>
+              <w:jc w:val="end"/>
+            </w:pPr>
+            <w:r>
+              <w:rPr>
+                <w:rFonts w:ascii="Calibri" w:hAnsi="Calibri"/>
+                <w:sz w:val="20"/>
+              </w:rPr>
+              <w:t xml:space="default">0.084</w:t>
+            </w:r>
+          </w:p>
+        </w:tc>
+        <w:tc>
+          <w:tcPr>
+            <w:tcBorders>
+              <w:top w:val="single" w:space="0" w:color="D3D3D3"/>
+              <w:bottom w:val="single" w:space="0" w:color="D3D3D3"/>
+              <w:start w:val="single" w:space="0" w:color="D3D3D3"/>
+              <w:end w:val="single" w:space="0" w:color="D3D3D3"/>
+            </w:tcBorders>
+          </w:tcPr>
+          <w:p>
+            <w:pPr>
+              <w:spacing w:before="0" w:after="60"/>
+              <w:keepNext/>
+              <w:jc w:val="end"/>
+            </w:pPr>
+            <w:r>
+              <w:rPr>
+                <w:rFonts w:ascii="Calibri" w:hAnsi="Calibri"/>
+                <w:sz w:val="20"/>
+              </w:rPr>
+              <w:t xml:space="default">0.338</w:t>
             </w:r>
           </w:p>
         </w:tc>
@@ -333,7 +473,7 @@
                 <w:rFonts w:ascii="Calibri" w:hAnsi="Calibri"/>
                 <w:sz w:val="20"/>
               </w:rPr>
-              <w:t xml:space="default">0.21 (0.084–0.34)</w:t>
+              <w:t xml:space="default">0.362</w:t>
             </w:r>
           </w:p>
         </w:tc>
@@ -357,7 +497,7 @@
                 <w:rFonts w:ascii="Calibri" w:hAnsi="Calibri"/>
                 <w:sz w:val="20"/>
               </w:rPr>
-              <w:t xml:space="default">0.37</w:t>
+              <w:t xml:space="default">PST &gt; FST</w:t>
             </w:r>
           </w:p>
         </w:tc>
@@ -410,7 +550,55 @@
                 <w:rFonts w:ascii="Calibri" w:hAnsi="Calibri"/>
                 <w:sz w:val="20"/>
               </w:rPr>
-              <w:t xml:space="default">185 (22)</w:t>
+              <w:t xml:space="default">0.155</w:t>
+            </w:r>
+          </w:p>
+        </w:tc>
+        <w:tc>
+          <w:tcPr>
+            <w:tcBorders>
+              <w:top w:val="single" w:space="0" w:color="D3D3D3"/>
+              <w:bottom w:val="single" w:space="0" w:color="D3D3D3"/>
+              <w:start w:val="single" w:space="0" w:color="D3D3D3"/>
+              <w:end w:val="single" w:space="0" w:color="D3D3D3"/>
+            </w:tcBorders>
+          </w:tcPr>
+          <w:p>
+            <w:pPr>
+              <w:spacing w:before="0" w:after="60"/>
+              <w:keepNext/>
+              <w:jc w:val="end"/>
+            </w:pPr>
+            <w:r>
+              <w:rPr>
+                <w:rFonts w:ascii="Calibri" w:hAnsi="Calibri"/>
+                <w:sz w:val="20"/>
+              </w:rPr>
+              <w:t xml:space="default">0.056</w:t>
+            </w:r>
+          </w:p>
+        </w:tc>
+        <w:tc>
+          <w:tcPr>
+            <w:tcBorders>
+              <w:top w:val="single" w:space="0" w:color="D3D3D3"/>
+              <w:bottom w:val="single" w:space="0" w:color="D3D3D3"/>
+              <w:start w:val="single" w:space="0" w:color="D3D3D3"/>
+              <w:end w:val="single" w:space="0" w:color="D3D3D3"/>
+            </w:tcBorders>
+          </w:tcPr>
+          <w:p>
+            <w:pPr>
+              <w:spacing w:before="0" w:after="60"/>
+              <w:keepNext/>
+              <w:jc w:val="end"/>
+            </w:pPr>
+            <w:r>
+              <w:rPr>
+                <w:rFonts w:ascii="Calibri" w:hAnsi="Calibri"/>
+                <w:sz w:val="20"/>
+              </w:rPr>
+              <w:t xml:space="default">0.274</w:t>
             </w:r>
           </w:p>
         </w:tc>
@@ -434,7 +622,7 @@
                 <w:rFonts w:ascii="Calibri" w:hAnsi="Calibri"/>
                 <w:sz w:val="20"/>
               </w:rPr>
-              <w:t xml:space="default">0.15 (0.056–0.27)</w:t>
+              <w:t xml:space="default">0.563</w:t>
             </w:r>
           </w:p>
         </w:tc>
@@ -458,7 +646,7 @@
                 <w:rFonts w:ascii="Calibri" w:hAnsi="Calibri"/>
                 <w:sz w:val="20"/>
               </w:rPr>
-              <w:t xml:space="default">0.57</w:t>
+              <w:t xml:space="default">PST &gt; FST</w:t>
             </w:r>
           </w:p>
         </w:tc>
@@ -511,7 +699,55 @@
                 <w:rFonts w:ascii="Calibri" w:hAnsi="Calibri"/>
                 <w:sz w:val="20"/>
               </w:rPr>
-              <w:t xml:space="default">180 (22)</w:t>
+              <w:t xml:space="default">0.107</w:t>
+            </w:r>
+          </w:p>
+        </w:tc>
+        <w:tc>
+          <w:tcPr>
+            <w:tcBorders>
+              <w:top w:val="single" w:space="0" w:color="D3D3D3"/>
+              <w:bottom w:val="single" w:space="0" w:color="D3D3D3"/>
+              <w:start w:val="single" w:space="0" w:color="D3D3D3"/>
+              <w:end w:val="single" w:space="0" w:color="D3D3D3"/>
+            </w:tcBorders>
+          </w:tcPr>
+          <w:p>
+            <w:pPr>
+              <w:spacing w:before="0" w:after="60"/>
+              <w:keepNext/>
+              <w:jc w:val="end"/>
+            </w:pPr>
+            <w:r>
+              <w:rPr>
+                <w:rFonts w:ascii="Calibri" w:hAnsi="Calibri"/>
+                <w:sz w:val="20"/>
+              </w:rPr>
+              <w:t xml:space="default">0.024</w:t>
+            </w:r>
+          </w:p>
+        </w:tc>
+        <w:tc>
+          <w:tcPr>
+            <w:tcBorders>
+              <w:top w:val="single" w:space="0" w:color="D3D3D3"/>
+              <w:bottom w:val="single" w:space="0" w:color="D3D3D3"/>
+              <w:start w:val="single" w:space="0" w:color="D3D3D3"/>
+              <w:end w:val="single" w:space="0" w:color="D3D3D3"/>
+            </w:tcBorders>
+          </w:tcPr>
+          <w:p>
+            <w:pPr>
+              <w:spacing w:before="0" w:after="60"/>
+              <w:keepNext/>
+              <w:jc w:val="end"/>
+            </w:pPr>
+            <w:r>
+              <w:rPr>
+                <w:rFonts w:ascii="Calibri" w:hAnsi="Calibri"/>
+                <w:sz w:val="20"/>
+              </w:rPr>
+              <w:t xml:space="default">0.208</w:t>
             </w:r>
           </w:p>
         </w:tc>
@@ -535,7 +771,7 @@
                 <w:rFonts w:ascii="Calibri" w:hAnsi="Calibri"/>
                 <w:sz w:val="20"/>
               </w:rPr>
-              <w:t xml:space="default">0.11 (0.024–0.21)</w:t>
+              <w:t xml:space="default">—</w:t>
             </w:r>
           </w:p>
         </w:tc>
@@ -559,7 +795,7 @@
                 <w:rFonts w:ascii="Calibri" w:hAnsi="Calibri"/>
                 <w:sz w:val="20"/>
               </w:rPr>
-              <w:t xml:space="default">1.37</w:t>
+              <w:t xml:space="default">PST = FST</w:t>
             </w:r>
           </w:p>
         </w:tc>
@@ -612,7 +848,55 @@
                 <w:rFonts w:ascii="Calibri" w:hAnsi="Calibri"/>
                 <w:sz w:val="20"/>
               </w:rPr>
-              <w:t xml:space="default">182 (22)</w:t>
+              <w:t xml:space="default">0.055</w:t>
+            </w:r>
+          </w:p>
+        </w:tc>
+        <w:tc>
+          <w:tcPr>
+            <w:tcBorders>
+              <w:top w:val="single" w:space="0" w:color="D3D3D3"/>
+              <w:bottom w:val="single" w:space="0" w:color="D3D3D3"/>
+              <w:start w:val="single" w:space="0" w:color="D3D3D3"/>
+              <w:end w:val="single" w:space="0" w:color="D3D3D3"/>
+            </w:tcBorders>
+          </w:tcPr>
+          <w:p>
+            <w:pPr>
+              <w:spacing w:before="0" w:after="60"/>
+              <w:keepNext/>
+              <w:jc w:val="end"/>
+            </w:pPr>
+            <w:r>
+              <w:rPr>
+                <w:rFonts w:ascii="Calibri" w:hAnsi="Calibri"/>
+                <w:sz w:val="20"/>
+              </w:rPr>
+              <w:t xml:space="default">0.000</w:t>
+            </w:r>
+          </w:p>
+        </w:tc>
+        <w:tc>
+          <w:tcPr>
+            <w:tcBorders>
+              <w:top w:val="single" w:space="0" w:color="D3D3D3"/>
+              <w:bottom w:val="single" w:space="0" w:color="D3D3D3"/>
+              <w:start w:val="single" w:space="0" w:color="D3D3D3"/>
+              <w:end w:val="single" w:space="0" w:color="D3D3D3"/>
+            </w:tcBorders>
+          </w:tcPr>
+          <w:p>
+            <w:pPr>
+              <w:spacing w:before="0" w:after="60"/>
+              <w:keepNext/>
+              <w:jc w:val="end"/>
+            </w:pPr>
+            <w:r>
+              <w:rPr>
+                <w:rFonts w:ascii="Calibri" w:hAnsi="Calibri"/>
+                <w:sz w:val="20"/>
+              </w:rPr>
+              <w:t xml:space="default">0.129</w:t>
             </w:r>
           </w:p>
         </w:tc>
@@ -636,7 +920,7 @@
                 <w:rFonts w:ascii="Calibri" w:hAnsi="Calibri"/>
                 <w:sz w:val="20"/>
               </w:rPr>
-              <w:t xml:space="default">0.055 (0–0.13)</w:t>
+              <w:t xml:space="default">—</w:t>
             </w:r>
           </w:p>
         </w:tc>
@@ -660,7 +944,7 @@
                 <w:rFonts w:ascii="Calibri" w:hAnsi="Calibri"/>
                 <w:sz w:val="20"/>
               </w:rPr>
-              <w:t xml:space="default">never</w:t>
+              <w:t xml:space="default">PST = FST</w:t>
             </w:r>
           </w:p>
         </w:tc>
@@ -671,19 +955,168 @@
         </w:trPr>
         <w:tc>
           <w:tcPr>
-            <w:gridSpan w:val="4"/>
-          </w:tcPr>
-          <w:p>
-            <w:pPr>
-              <w:spacing w:before="0" w:after="60"/>
-              <w:keepNext/>
-            </w:pPr>
-            <w:r>
-              <w:rPr>
-                <w:rFonts w:ascii="Calibri" w:hAnsi="Calibri"/>
-                <w:sz w:val="20"/>
-              </w:rPr>
-              <w:t xml:space="default">Pst = (c/h² Vb) / (c/h² Vb + 2 Vw), Vb and Vw from luminance ~ Age + (1 | site); 95% CI from 1000 parametric bootstraps. Pairwise Fst among the 22 sites: mean 0.032 (range 0.025–0.044). Critical c/h² = smallest c/h² at which the lower 95% CI of Pst exceeds mean Fst.</w:t>
+            <w:tcBorders>
+              <w:top w:val="single" w:space="0" w:color="D3D3D3"/>
+              <w:bottom w:val="single" w:space="0" w:color="D3D3D3"/>
+              <w:start w:val="single" w:space="0" w:color="D3D3D3"/>
+              <w:end w:val="single" w:space="0" w:color="D3D3D3"/>
+            </w:tcBorders>
+          </w:tcPr>
+          <w:p>
+            <w:pPr>
+              <w:spacing w:before="0" w:after="60"/>
+              <w:keepNext/>
+              <w:jc w:val="start"/>
+            </w:pPr>
+            <w:r>
+              <w:rPr>
+                <w:rFonts w:ascii="Calibri" w:hAnsi="Calibri"/>
+                <w:sz w:val="20"/>
+              </w:rPr>
+              <w:t xml:space="default">Wing spot area (mm²)</w:t>
+            </w:r>
+          </w:p>
+        </w:tc>
+        <w:tc>
+          <w:tcPr>
+            <w:tcBorders>
+              <w:top w:val="single" w:space="0" w:color="D3D3D3"/>
+              <w:bottom w:val="single" w:space="0" w:color="D3D3D3"/>
+              <w:start w:val="single" w:space="0" w:color="D3D3D3"/>
+              <w:end w:val="single" w:space="0" w:color="D3D3D3"/>
+            </w:tcBorders>
+          </w:tcPr>
+          <w:p>
+            <w:pPr>
+              <w:spacing w:before="0" w:after="60"/>
+              <w:keepNext/>
+              <w:jc w:val="end"/>
+            </w:pPr>
+            <w:r>
+              <w:rPr>
+                <w:rFonts w:ascii="Calibri" w:hAnsi="Calibri"/>
+                <w:sz w:val="20"/>
+              </w:rPr>
+              <w:t xml:space="default">0.010</w:t>
+            </w:r>
+          </w:p>
+        </w:tc>
+        <w:tc>
+          <w:tcPr>
+            <w:tcBorders>
+              <w:top w:val="single" w:space="0" w:color="D3D3D3"/>
+              <w:bottom w:val="single" w:space="0" w:color="D3D3D3"/>
+              <w:start w:val="single" w:space="0" w:color="D3D3D3"/>
+              <w:end w:val="single" w:space="0" w:color="D3D3D3"/>
+            </w:tcBorders>
+          </w:tcPr>
+          <w:p>
+            <w:pPr>
+              <w:spacing w:before="0" w:after="60"/>
+              <w:keepNext/>
+              <w:jc w:val="end"/>
+            </w:pPr>
+            <w:r>
+              <w:rPr>
+                <w:rFonts w:ascii="Calibri" w:hAnsi="Calibri"/>
+                <w:sz w:val="20"/>
+              </w:rPr>
+              <w:t xml:space="default">0.000</w:t>
+            </w:r>
+          </w:p>
+        </w:tc>
+        <w:tc>
+          <w:tcPr>
+            <w:tcBorders>
+              <w:top w:val="single" w:space="0" w:color="D3D3D3"/>
+              <w:bottom w:val="single" w:space="0" w:color="D3D3D3"/>
+              <w:start w:val="single" w:space="0" w:color="D3D3D3"/>
+              <w:end w:val="single" w:space="0" w:color="D3D3D3"/>
+            </w:tcBorders>
+          </w:tcPr>
+          <w:p>
+            <w:pPr>
+              <w:spacing w:before="0" w:after="60"/>
+              <w:keepNext/>
+              <w:jc w:val="end"/>
+            </w:pPr>
+            <w:r>
+              <w:rPr>
+                <w:rFonts w:ascii="Calibri" w:hAnsi="Calibri"/>
+                <w:sz w:val="20"/>
+              </w:rPr>
+              <w:t xml:space="default">0.065</w:t>
+            </w:r>
+          </w:p>
+        </w:tc>
+        <w:tc>
+          <w:tcPr>
+            <w:tcBorders>
+              <w:top w:val="single" w:space="0" w:color="D3D3D3"/>
+              <w:bottom w:val="single" w:space="0" w:color="D3D3D3"/>
+              <w:start w:val="single" w:space="0" w:color="D3D3D3"/>
+              <w:end w:val="single" w:space="0" w:color="D3D3D3"/>
+            </w:tcBorders>
+          </w:tcPr>
+          <w:p>
+            <w:pPr>
+              <w:spacing w:before="0" w:after="60"/>
+              <w:keepNext/>
+              <w:jc w:val="start"/>
+            </w:pPr>
+            <w:r>
+              <w:rPr>
+                <w:rFonts w:ascii="Calibri" w:hAnsi="Calibri"/>
+                <w:sz w:val="20"/>
+              </w:rPr>
+              <w:t xml:space="default">—</w:t>
+            </w:r>
+          </w:p>
+        </w:tc>
+        <w:tc>
+          <w:tcPr>
+            <w:tcBorders>
+              <w:top w:val="single" w:space="0" w:color="D3D3D3"/>
+              <w:bottom w:val="single" w:space="0" w:color="D3D3D3"/>
+              <w:start w:val="single" w:space="0" w:color="D3D3D3"/>
+              <w:end w:val="single" w:space="0" w:color="D3D3D3"/>
+            </w:tcBorders>
+          </w:tcPr>
+          <w:p>
+            <w:pPr>
+              <w:spacing w:before="0" w:after="60"/>
+              <w:keepNext/>
+              <w:jc w:val="start"/>
+            </w:pPr>
+            <w:r>
+              <w:rPr>
+                <w:rFonts w:ascii="Calibri" w:hAnsi="Calibri"/>
+                <w:sz w:val="20"/>
+              </w:rPr>
+              <w:t xml:space="default">PST = FST</w:t>
+            </w:r>
+          </w:p>
+        </w:tc>
+      </w:tr>
+      <w:tr>
+        <w:trPr>
+          <w:cantSplit/>
+        </w:trPr>
+        <w:tc>
+          <w:tcPr>
+            <w:gridSpan w:val="6"/>
+          </w:tcPr>
+          <w:p>
+            <w:pPr>
+              <w:spacing w:before="0" w:after="60"/>
+              <w:keepNext/>
+            </w:pPr>
+            <w:r>
+              <w:rPr>
+                <w:rFonts w:ascii="Calibri" w:hAnsi="Calibri"/>
+                <w:sz w:val="20"/>
+              </w:rPr>
+              <w:t xml:space="default">Pst = (c/h² Vb) / (c/h² Vb + 2 Vw), Vb and Vw from trait ~ Age + (1 | site); 95% CI from 1000 parametric bootstraps. Pairwise Fst among the 22 sites: mean 0.032 (range 0.025–0.044). Critical c/h² = smallest c/h² at which the lower 95% CI of Pst exceeds mean Fst (— : not reached by c/h² = 1). PST ≫ FST: critical c/h² ≤ 0.125; PST &gt; FST: ≤ 1; PST = FST: otherwise.</w:t>
             </w:r>
           </w:p>
         </w:tc>

</xml_diff>

<commit_message>
adding regression models for describing environment
</commit_message>
<xml_diff>
--- a/results/tables/Pst_Fst_table.docx
+++ b/results/tables/Pst_Fst_table.docx
@@ -324,7 +324,7 @@
                 <w:rFonts w:ascii="Calibri" w:hAnsi="Calibri"/>
                 <w:sz w:val="20"/>
               </w:rPr>
-              <w:t xml:space="default">0.155</w:t>
+              <w:t xml:space="default">0.211</w:t>
             </w:r>
           </w:p>
         </w:tc>
@@ -473,7 +473,7 @@
                 <w:rFonts w:ascii="Calibri" w:hAnsi="Calibri"/>
                 <w:sz w:val="20"/>
               </w:rPr>
-              <w:t xml:space="default">0.362</w:t>
+              <w:t xml:space="default">0.492</w:t>
             </w:r>
           </w:p>
         </w:tc>
@@ -622,7 +622,7 @@
                 <w:rFonts w:ascii="Calibri" w:hAnsi="Calibri"/>
                 <w:sz w:val="20"/>
               </w:rPr>
-              <w:t xml:space="default">0.563</w:t>
+              <w:t xml:space="default">0.766</w:t>
             </w:r>
           </w:p>
         </w:tc>
@@ -824,7 +824,7 @@
                 <w:rFonts w:ascii="Calibri" w:hAnsi="Calibri"/>
                 <w:sz w:val="20"/>
               </w:rPr>
-              <w:t xml:space="default">Wing spot luminance</w:t>
+              <w:t xml:space="default">Wing spot area (mm²)</w:t>
             </w:r>
           </w:p>
         </w:tc>
@@ -848,7 +848,7 @@
                 <w:rFonts w:ascii="Calibri" w:hAnsi="Calibri"/>
                 <w:sz w:val="20"/>
               </w:rPr>
-              <w:t xml:space="default">0.055</w:t>
+              <w:t xml:space="default">0.010</w:t>
             </w:r>
           </w:p>
         </w:tc>
@@ -896,7 +896,7 @@
                 <w:rFonts w:ascii="Calibri" w:hAnsi="Calibri"/>
                 <w:sz w:val="20"/>
               </w:rPr>
-              <w:t xml:space="default">0.129</w:t>
+              <w:t xml:space="default">0.059</w:t>
             </w:r>
           </w:p>
         </w:tc>
@@ -955,155 +955,6 @@
         </w:trPr>
         <w:tc>
           <w:tcPr>
-            <w:tcBorders>
-              <w:top w:val="single" w:space="0" w:color="D3D3D3"/>
-              <w:bottom w:val="single" w:space="0" w:color="D3D3D3"/>
-              <w:start w:val="single" w:space="0" w:color="D3D3D3"/>
-              <w:end w:val="single" w:space="0" w:color="D3D3D3"/>
-            </w:tcBorders>
-          </w:tcPr>
-          <w:p>
-            <w:pPr>
-              <w:spacing w:before="0" w:after="60"/>
-              <w:keepNext/>
-              <w:jc w:val="start"/>
-            </w:pPr>
-            <w:r>
-              <w:rPr>
-                <w:rFonts w:ascii="Calibri" w:hAnsi="Calibri"/>
-                <w:sz w:val="20"/>
-              </w:rPr>
-              <w:t xml:space="default">Wing spot area (mm²)</w:t>
-            </w:r>
-          </w:p>
-        </w:tc>
-        <w:tc>
-          <w:tcPr>
-            <w:tcBorders>
-              <w:top w:val="single" w:space="0" w:color="D3D3D3"/>
-              <w:bottom w:val="single" w:space="0" w:color="D3D3D3"/>
-              <w:start w:val="single" w:space="0" w:color="D3D3D3"/>
-              <w:end w:val="single" w:space="0" w:color="D3D3D3"/>
-            </w:tcBorders>
-          </w:tcPr>
-          <w:p>
-            <w:pPr>
-              <w:spacing w:before="0" w:after="60"/>
-              <w:keepNext/>
-              <w:jc w:val="end"/>
-            </w:pPr>
-            <w:r>
-              <w:rPr>
-                <w:rFonts w:ascii="Calibri" w:hAnsi="Calibri"/>
-                <w:sz w:val="20"/>
-              </w:rPr>
-              <w:t xml:space="default">0.010</w:t>
-            </w:r>
-          </w:p>
-        </w:tc>
-        <w:tc>
-          <w:tcPr>
-            <w:tcBorders>
-              <w:top w:val="single" w:space="0" w:color="D3D3D3"/>
-              <w:bottom w:val="single" w:space="0" w:color="D3D3D3"/>
-              <w:start w:val="single" w:space="0" w:color="D3D3D3"/>
-              <w:end w:val="single" w:space="0" w:color="D3D3D3"/>
-            </w:tcBorders>
-          </w:tcPr>
-          <w:p>
-            <w:pPr>
-              <w:spacing w:before="0" w:after="60"/>
-              <w:keepNext/>
-              <w:jc w:val="end"/>
-            </w:pPr>
-            <w:r>
-              <w:rPr>
-                <w:rFonts w:ascii="Calibri" w:hAnsi="Calibri"/>
-                <w:sz w:val="20"/>
-              </w:rPr>
-              <w:t xml:space="default">0.000</w:t>
-            </w:r>
-          </w:p>
-        </w:tc>
-        <w:tc>
-          <w:tcPr>
-            <w:tcBorders>
-              <w:top w:val="single" w:space="0" w:color="D3D3D3"/>
-              <w:bottom w:val="single" w:space="0" w:color="D3D3D3"/>
-              <w:start w:val="single" w:space="0" w:color="D3D3D3"/>
-              <w:end w:val="single" w:space="0" w:color="D3D3D3"/>
-            </w:tcBorders>
-          </w:tcPr>
-          <w:p>
-            <w:pPr>
-              <w:spacing w:before="0" w:after="60"/>
-              <w:keepNext/>
-              <w:jc w:val="end"/>
-            </w:pPr>
-            <w:r>
-              <w:rPr>
-                <w:rFonts w:ascii="Calibri" w:hAnsi="Calibri"/>
-                <w:sz w:val="20"/>
-              </w:rPr>
-              <w:t xml:space="default">0.065</w:t>
-            </w:r>
-          </w:p>
-        </w:tc>
-        <w:tc>
-          <w:tcPr>
-            <w:tcBorders>
-              <w:top w:val="single" w:space="0" w:color="D3D3D3"/>
-              <w:bottom w:val="single" w:space="0" w:color="D3D3D3"/>
-              <w:start w:val="single" w:space="0" w:color="D3D3D3"/>
-              <w:end w:val="single" w:space="0" w:color="D3D3D3"/>
-            </w:tcBorders>
-          </w:tcPr>
-          <w:p>
-            <w:pPr>
-              <w:spacing w:before="0" w:after="60"/>
-              <w:keepNext/>
-              <w:jc w:val="start"/>
-            </w:pPr>
-            <w:r>
-              <w:rPr>
-                <w:rFonts w:ascii="Calibri" w:hAnsi="Calibri"/>
-                <w:sz w:val="20"/>
-              </w:rPr>
-              <w:t xml:space="default">—</w:t>
-            </w:r>
-          </w:p>
-        </w:tc>
-        <w:tc>
-          <w:tcPr>
-            <w:tcBorders>
-              <w:top w:val="single" w:space="0" w:color="D3D3D3"/>
-              <w:bottom w:val="single" w:space="0" w:color="D3D3D3"/>
-              <w:start w:val="single" w:space="0" w:color="D3D3D3"/>
-              <w:end w:val="single" w:space="0" w:color="D3D3D3"/>
-            </w:tcBorders>
-          </w:tcPr>
-          <w:p>
-            <w:pPr>
-              <w:spacing w:before="0" w:after="60"/>
-              <w:keepNext/>
-              <w:jc w:val="start"/>
-            </w:pPr>
-            <w:r>
-              <w:rPr>
-                <w:rFonts w:ascii="Calibri" w:hAnsi="Calibri"/>
-                <w:sz w:val="20"/>
-              </w:rPr>
-              <w:t xml:space="default">PST = FST</w:t>
-            </w:r>
-          </w:p>
-        </w:tc>
-      </w:tr>
-      <w:tr>
-        <w:trPr>
-          <w:cantSplit/>
-        </w:trPr>
-        <w:tc>
-          <w:tcPr>
             <w:gridSpan w:val="6"/>
           </w:tcPr>
           <w:p>
@@ -1116,7 +967,7 @@
                 <w:rFonts w:ascii="Calibri" w:hAnsi="Calibri"/>
                 <w:sz w:val="20"/>
               </w:rPr>
-              <w:t xml:space="default">Pst = (c/h² Vb) / (c/h² Vb + 2 Vw), Vb and Vw from trait ~ Age + (1 | site); 95% CI from 1000 parametric bootstraps. Pairwise Fst among the 22 sites: mean 0.032 (range 0.025–0.044). Critical c/h² = smallest c/h² at which the lower 95% CI of Pst exceeds mean Fst (— : not reached by c/h² = 1). PST ≫ FST: critical c/h² ≤ 0.125; PST &gt; FST: ≤ 1; PST = FST: otherwise.</w:t>
+              <w:t xml:space="default">Pst = (c/h² Vb) / (c/h² Vb + 2 Vw), Vb and Vw from trait ~ Age + (1 | site); 95% CI from 1000 parametric bootstraps. Pairwise Fst among the 22 sites: mean 0.043 (range 0.030–0.067). Critical c/h² = smallest c/h² at which the lower 95% CI of Pst exceeds mean Fst (— : not reached by c/h² = 1). PST ≫ FST: critical c/h² ≤ 0.125; PST &gt; FST: ≤ 1; PST = FST: otherwise.</w:t>
             </w:r>
           </w:p>
         </w:tc>

</xml_diff>